<commit_message>
Documento de sustentacion actualizado con despliegue en Render y Aiven
Co-authored-by: Copilot <223556219+Copilot@users.noreply.github.com>
</commit_message>
<xml_diff>
--- a/docs/Explicacion_Proyecto_COGNIA.docx
+++ b/docs/Explicacion_Proyecto_COGNIA.docx
@@ -44,6 +44,14 @@
       </w:pPr>
       <w:r>
         <w:t>Repositorio: https://github.com/andresduarte1231/Cognia</w:t>
+      </w:r>
+    </w:p>
+    <w:p>
+      <w:pPr>
+        <w:jc w:val="center"/>
+      </w:pPr>
+      <w:r>
+        <w:t>Aplicación en línea: https://cognia-gateway.onrender.com</w:t>
       </w:r>
     </w:p>
     <w:p/>
@@ -562,6 +570,88 @@
               <w:rPr>
                 <w:sz w:val="20"/>
               </w:rPr>
+              <w:t>Despliegue en la nube</w:t>
+            </w:r>
+          </w:p>
+        </w:tc>
+        <w:tc>
+          <w:tcPr>
+            <w:tcW w:type="dxa" w:w="3744"/>
+          </w:tcPr>
+          <w:p>
+            <w:r>
+              <w:rPr>
+                <w:sz w:val="20"/>
+              </w:rPr>
+              <w:t>Render (4 servicios web); Docker solo para empaquetar</w:t>
+            </w:r>
+          </w:p>
+        </w:tc>
+        <w:tc>
+          <w:tcPr>
+            <w:tcW w:type="dxa" w:w="4320"/>
+          </w:tcPr>
+          <w:p>
+            <w:r>
+              <w:rPr>
+                <w:sz w:val="20"/>
+              </w:rPr>
+              <w:t>Blueprint render.yaml y Dockerfiles en deployment\render; región Oregon, plan gratuito</w:t>
+            </w:r>
+          </w:p>
+        </w:tc>
+      </w:tr>
+      <w:tr>
+        <w:tc>
+          <w:tcPr>
+            <w:tcW w:type="dxa" w:w="1872"/>
+          </w:tcPr>
+          <w:p>
+            <w:r>
+              <w:rPr>
+                <w:sz w:val="20"/>
+              </w:rPr>
+              <w:t>Base de datos en la nube</w:t>
+            </w:r>
+          </w:p>
+        </w:tc>
+        <w:tc>
+          <w:tcPr>
+            <w:tcW w:type="dxa" w:w="3744"/>
+          </w:tcPr>
+          <w:p>
+            <w:r>
+              <w:rPr>
+                <w:sz w:val="20"/>
+              </w:rPr>
+              <w:t>Aiven for MySQL</w:t>
+            </w:r>
+          </w:p>
+        </w:tc>
+        <w:tc>
+          <w:tcPr>
+            <w:tcW w:type="dxa" w:w="4320"/>
+          </w:tcPr>
+          <w:p>
+            <w:r>
+              <w:rPr>
+                <w:sz w:val="20"/>
+              </w:rPr>
+              <w:t>Base defaultdb con SSL; en local sigue MariaDB de XAMPP</w:t>
+            </w:r>
+          </w:p>
+        </w:tc>
+      </w:tr>
+      <w:tr>
+        <w:tc>
+          <w:tcPr>
+            <w:tcW w:type="dxa" w:w="1872"/>
+          </w:tcPr>
+          <w:p>
+            <w:r>
+              <w:rPr>
+                <w:sz w:val="20"/>
+              </w:rPr>
               <w:t>Node.js / npm</w:t>
             </w:r>
           </w:p>
@@ -601,7 +691,7 @@
           <w:b w:val="0"/>
           <w:i/>
         </w:rPr>
-        <w:t>Restricciones que se cumplieron: no hay Docker ni Kubernetes; no hay Node/Express en el backend; todo el backend es Java con Spring Boot; cada servicio aplica el patrón MVC.</w:t>
+        <w:t>Restricciones que se cumplieron: el desarrollo y la ejecución local no usan Docker ni Kubernetes (Docker aparece únicamente como empaquetado para el despliegue en Render, que no ejecuta Java de forma nativa); no hay Node/Express en el backend; todo el backend es Java con Spring Boot; cada servicio aplica el patrón MVC.</w:t>
       </w:r>
     </w:p>
     <w:p>
@@ -1013,6 +1103,60 @@
               <w:rPr>
                 <w:sz w:val="20"/>
               </w:rPr>
+              <w:t>Despliegue en Render</w:t>
+            </w:r>
+          </w:p>
+        </w:tc>
+        <w:tc>
+          <w:tcPr>
+            <w:tcW w:type="dxa" w:w="2592"/>
+          </w:tcPr>
+          <w:p>
+            <w:r>
+              <w:rPr>
+                <w:sz w:val="20"/>
+              </w:rPr>
+              <w:t>render.yaml y deployment\render</w:t>
+            </w:r>
+          </w:p>
+        </w:tc>
+        <w:tc>
+          <w:tcPr>
+            <w:tcW w:type="dxa" w:w="1008"/>
+          </w:tcPr>
+          <w:p>
+            <w:r>
+              <w:rPr>
+                <w:sz w:val="20"/>
+              </w:rPr>
+              <w:t>10000 (interno)</w:t>
+            </w:r>
+          </w:p>
+        </w:tc>
+        <w:tc>
+          <w:tcPr>
+            <w:tcW w:type="dxa" w:w="4032"/>
+          </w:tcPr>
+          <w:p>
+            <w:r>
+              <w:rPr>
+                <w:sz w:val="20"/>
+              </w:rPr>
+              <w:t>Blueprint con los 4 servicios y un Dockerfile por servicio.</w:t>
+            </w:r>
+          </w:p>
+        </w:tc>
+      </w:tr>
+      <w:tr>
+        <w:tc>
+          <w:tcPr>
+            <w:tcW w:type="dxa" w:w="2304"/>
+          </w:tcPr>
+          <w:p>
+            <w:r>
+              <w:rPr>
+                <w:sz w:val="20"/>
+              </w:rPr>
               <w:t>Base de datos</w:t>
             </w:r>
           </w:p>
@@ -1039,7 +1183,7 @@
               <w:rPr>
                 <w:sz w:val="20"/>
               </w:rPr>
-              <w:t>3306</w:t>
+              <w:t>3306 (local)</w:t>
             </w:r>
           </w:p>
         </w:tc>
@@ -1052,7 +1196,7 @@
               <w:rPr>
                 <w:sz w:val="20"/>
               </w:rPr>
-              <w:t>Migraciones (database\migrations), semillas (database\seed), scripts y respaldo. El motor corre en XAMPP.</w:t>
+              <w:t>Migraciones (database\migrations), semillas (database\seed), scripts y respaldo. En local corre en XAMPP; en la nube, en Aiven. Para la nube: deploy-schema.sql y deploy-data.sql.</w:t>
             </w:r>
           </w:p>
         </w:tc>
@@ -2177,7 +2321,7 @@
               <w:rPr>
                 <w:sz w:val="20"/>
               </w:rPr>
-              <w:t>Repositorio en GitHub; .gitignore</w:t>
+              <w:t>Repositorio en GitHub; .gitignore; Render toma el código de este repositorio</w:t>
             </w:r>
           </w:p>
         </w:tc>
@@ -2205,7 +2349,7 @@
               <w:rPr>
                 <w:sz w:val="20"/>
               </w:rPr>
-              <w:t>Despliegue local en Windows sin Docker: MariaDB en XAMPP; cada servicio como proceso Java independiente; el propio gateway sirve el frontend. Se ejecuta con un solo comando.</w:t>
+              <w:t>Dos formas: (a) local en Windows, con MariaDB en XAMPP y cada servicio como proceso Java independiente (un solo comando); (b) en internet: los 4 servicios en Render y la base de datos en Aiven. El gateway sirve el frontend y es la única URL pública.</w:t>
             </w:r>
           </w:p>
         </w:tc>
@@ -2218,7 +2362,7 @@
               <w:rPr>
                 <w:sz w:val="20"/>
               </w:rPr>
-              <w:t>java -jar, scripts PowerShell</w:t>
+              <w:t>Render, Dockerfile, Aiven, scripts PowerShell</w:t>
             </w:r>
           </w:p>
         </w:tc>
@@ -2231,7 +2375,7 @@
               <w:rPr>
                 <w:sz w:val="20"/>
               </w:rPr>
-              <w:t>scripts\start-all.ps1 y run-service.ps1</w:t>
+              <w:t>render.yaml; deployment\render\Dockerfile.*; scripts\start-all.ps1</w:t>
             </w:r>
           </w:p>
         </w:tc>
@@ -2698,6 +2842,167 @@
     </w:p>
     <w:p>
       <w:pPr>
+        <w:pStyle w:val="Heading2"/>
+      </w:pPr>
+      <w:r>
+        <w:t>4.2 Despliegue en la nube (Render + Aiven)</w:t>
+      </w:r>
+    </w:p>
+    <w:p>
+      <w:r>
+        <w:rPr>
+          <w:b w:val="0"/>
+          <w:i w:val="0"/>
+        </w:rPr>
+        <w:t>La aplicación quedó publicada en internet: https://cognia-gateway.onrender.com. Procedimiento seguido:</w:t>
+      </w:r>
+    </w:p>
+    <w:p>
+      <w:pPr>
+        <w:pStyle w:val="ListBullet"/>
+      </w:pPr>
+      <w:r>
+        <w:rPr>
+          <w:b/>
+        </w:rPr>
+        <w:t xml:space="preserve">1. Base de datos en la nube: </w:t>
+      </w:r>
+      <w:r>
+        <w:t>se creó un servicio MySQL en Aiven. Con un script se cargaron las 9 tablas (database\deploy-schema.sql) y los datos del catálogo: 6 categorías, 14 productos y la configuración de la tienda (database\deploy-data.sql). No se copiaron usuarios ni contraseñas.</w:t>
+      </w:r>
+    </w:p>
+    <w:p>
+      <w:pPr>
+        <w:pStyle w:val="ListBullet"/>
+      </w:pPr>
+      <w:r>
+        <w:rPr>
+          <w:b/>
+        </w:rPr>
+        <w:t xml:space="preserve">2. Empaquetado: </w:t>
+      </w:r>
+      <w:r>
+        <w:t>un Dockerfile por servicio en deployment\render. Compila con Maven en una primera etapa y ejecuta el JAR con Java 21 en la segunda; el del gateway compila además el frontend React. Docker se usó solo para esto, porque Render no ejecuta Java directamente.</w:t>
+      </w:r>
+    </w:p>
+    <w:p>
+      <w:pPr>
+        <w:pStyle w:val="ListBullet"/>
+      </w:pPr>
+      <w:r>
+        <w:rPr>
+          <w:b/>
+        </w:rPr>
+        <w:t xml:space="preserve">3. Blueprint: </w:t>
+      </w:r>
+      <w:r>
+        <w:t>render.yaml declara los 4 servicios web (cognia-gateway, cognia-auth, cognia-catalog, cognia-orders), su Dockerfile, su health check (/actuator/health) y sus variables de entorno.</w:t>
+      </w:r>
+    </w:p>
+    <w:p>
+      <w:pPr>
+        <w:pStyle w:val="ListBullet"/>
+      </w:pPr>
+      <w:r>
+        <w:rPr>
+          <w:b/>
+        </w:rPr>
+        <w:t xml:space="preserve">4. Variables de entorno: </w:t>
+      </w:r>
+      <w:r>
+        <w:t>las credenciales no están en el código; se ingresan en el panel de Render: DB_HOST, DB_PORT, DB_NAME, DB_USER, DB_PASSWORD, DB_PARAMS (SSL), JWT_SECRET, METRICS_PASSWORD, CORS_ORIGINS y OWNER_BOOTSTRAP_TOKEN. El mismo JWT_SECRET en los tres servicios de negocio permite validar los tokens entre ellos.</w:t>
+      </w:r>
+    </w:p>
+    <w:p>
+      <w:pPr>
+        <w:pStyle w:val="ListBullet"/>
+      </w:pPr>
+      <w:r>
+        <w:rPr>
+          <w:b/>
+        </w:rPr>
+        <w:t xml:space="preserve">5. Comunicación entre servicios: </w:t>
+      </w:r>
+      <w:r>
+        <w:t>el gateway enruta con AUTH_URL, CATALOG_URL y ORDERS_URL; pedidos usa CATALOG_URL y AUTH_URL para hablar con catálogo y usuarios.</w:t>
+      </w:r>
+    </w:p>
+    <w:p>
+      <w:pPr>
+        <w:pStyle w:val="ListBullet"/>
+      </w:pPr>
+      <w:r>
+        <w:rPr>
+          <w:b/>
+        </w:rPr>
+        <w:t xml:space="preserve">6. Primer propietario: </w:t>
+      </w:r>
+      <w:r>
+        <w:t>se crea con el endpoint /api/auth/inicializar-propietario, protegido por la cabecera X-Bootstrap-Token, para no dejar contraseñas en el repositorio.</w:t>
+      </w:r>
+    </w:p>
+    <w:p>
+      <w:pPr>
+        <w:ind w:left="432"/>
+      </w:pPr>
+      <w:r>
+        <w:rPr>
+          <w:rFonts w:ascii="Consolas" w:hAnsi="Consolas"/>
+          <w:sz w:val="19"/>
+        </w:rPr>
+        <w:t>Usuario ──HTTPS──► cognia-gateway (Render) ──► cognia-auth</w:t>
+        <w:br/>
+        <w:t xml:space="preserve">                                          ├─► cognia-catalog</w:t>
+        <w:br/>
+        <w:t xml:space="preserve">                                          └─► cognia-orders</w:t>
+        <w:br/>
+        <w:t xml:space="preserve">                          los 3 servicios ──SSL──► Aiven MySQL (defaultdb)</w:t>
+      </w:r>
+    </w:p>
+    <w:p>
+      <w:r>
+        <w:rPr>
+          <w:b/>
+          <w:i w:val="0"/>
+        </w:rPr>
+        <w:t>Ajustes que hubo que hacer al desplegar (lecciones aprendidas):</w:t>
+      </w:r>
+    </w:p>
+    <w:p>
+      <w:pPr>
+        <w:pStyle w:val="ListBullet"/>
+      </w:pPr>
+      <w:r>
+        <w:t>CORS: el navegador envía el origen de la página; si no está en CORS_ORIGINS, el gateway responde 403. Se corrigió añadiendo la URL del gateway.</w:t>
+      </w:r>
+    </w:p>
+    <w:p>
+      <w:pPr>
+        <w:pStyle w:val="ListBullet"/>
+      </w:pPr>
+      <w:r>
+        <w:t>El URL de la base de datos ahora acepta DB_PARAMS para activar SSL, requisito de Aiven.</w:t>
+      </w:r>
+    </w:p>
+    <w:p>
+      <w:pPr>
+        <w:pStyle w:val="ListBullet"/>
+      </w:pPr>
+      <w:r>
+        <w:t>Comunicación entre servicios: se usan las URLs públicas de Render (https://cognia-&lt;servicio&gt;.onrender.com).</w:t>
+      </w:r>
+    </w:p>
+    <w:p>
+      <w:r>
+        <w:rPr>
+          <w:b w:val="0"/>
+          <w:i/>
+        </w:rPr>
+        <w:t>Limitaciones del plan gratuito: los servicios se duermen tras unos 15 minutos sin tráfico y la primera petición tarda en despertarlos; las imágenes subidas desde el panel se pierden al reiniciar (no hay disco persistente); Prometheus y Grafana no se despliegan en Render y siguen siendo locales, por lo que la fase Operate se demuestra en el entorno local.</w:t>
+      </w:r>
+    </w:p>
+    <w:p>
+      <w:pPr>
         <w:pStyle w:val="Heading1"/>
       </w:pPr>
       <w:r>
@@ -2995,7 +3300,35 @@
               <w:rPr>
                 <w:sz w:val="20"/>
               </w:rPr>
-              <w:t>.env fuera de Git; usuario de base de datos de mínimo privilegio.</w:t>
+              <w:t>.env fuera de Git; en Render, las credenciales viven en variables de entorno del panel; usuario de base de datos de mínimo privilegio en local.</w:t>
+            </w:r>
+          </w:p>
+        </w:tc>
+      </w:tr>
+      <w:tr>
+        <w:tc>
+          <w:tcPr>
+            <w:tcW w:type="dxa" w:w="2448"/>
+          </w:tcPr>
+          <w:p>
+            <w:r>
+              <w:rPr>
+                <w:sz w:val="20"/>
+              </w:rPr>
+              <w:t>Transporte</w:t>
+            </w:r>
+          </w:p>
+        </w:tc>
+        <w:tc>
+          <w:tcPr>
+            <w:tcW w:type="dxa" w:w="7488"/>
+          </w:tcPr>
+          <w:p>
+            <w:r>
+              <w:rPr>
+                <w:sz w:val="20"/>
+              </w:rPr>
+              <w:t>HTTPS en Render y SSL en la conexión con Aiven.</w:t>
             </w:r>
           </w:p>
         </w:tc>
@@ -3044,7 +3377,7 @@
         <w:pStyle w:val="Heading1"/>
       </w:pPr>
       <w:r>
-        <w:t>6. Cómo ejecutar el proyecto</w:t>
+        <w:t>6. Cómo ejecutar el proyecto en local</w:t>
       </w:r>
     </w:p>
     <w:p>
@@ -3090,7 +3423,7 @@
           <w:b w:val="0"/>
           <w:i w:val="0"/>
         </w:rPr>
-        <w:t>Cuenta del propietario (solo desarrollo): propietario@cognia.local / Cognia2026Owner.</w:t>
+        <w:t>Cuenta del propietario (solo desarrollo local): propietario@cognia.local / Cognia2026Owner. En Render el propietario se crea con el token de arranque.</w:t>
       </w:r>
     </w:p>
     <w:p>
@@ -3398,6 +3731,34 @@
         <w:rPr>
           <w:b/>
         </w:rPr>
+        <w:t xml:space="preserve">¿Por qué Render y Aiven? </w:t>
+      </w:r>
+      <w:r>
+        <w:t>Render publica los servicios Spring Boot desde GitHub con un Blueprint y tiene plan gratuito; Aiven ofrece MySQL gratuito compatible con nuestro esquema (Render solo ofrece PostgreSQL).</w:t>
+      </w:r>
+    </w:p>
+    <w:p>
+      <w:pPr>
+        <w:pStyle w:val="ListBullet"/>
+      </w:pPr>
+      <w:r>
+        <w:rPr>
+          <w:b/>
+        </w:rPr>
+        <w:t xml:space="preserve">¿Por qué hay Dockerfiles si el proyecto no usa Docker? </w:t>
+      </w:r>
+      <w:r>
+        <w:t>Render no tiene entorno nativo de Java; el Dockerfile se usa solo para empaquetar en el despliegue. Local y desarrollo siguen sin Docker.</w:t>
+      </w:r>
+    </w:p>
+    <w:p>
+      <w:pPr>
+        <w:pStyle w:val="ListBullet"/>
+      </w:pPr>
+      <w:r>
+        <w:rPr>
+          <w:b/>
+        </w:rPr>
         <w:t xml:space="preserve">¿Por qué el gateway sirve el frontend y no Tomcat/XAMPP? </w:t>
       </w:r>
       <w:r>
@@ -3572,12 +3933,26 @@
           <w:b/>
           <w:color w:val="7F4828"/>
         </w:rPr>
-        <w:t>¿Por qué no está en GitHub Pages?</w:t>
+        <w:t>¿Dónde está publicada y por qué no en GitHub Pages?</w:t>
       </w:r>
     </w:p>
     <w:p>
       <w:r>
-        <w:t>GitHub Pages solo sirve archivos estáticos. La tienda necesita Java y MariaDB, así que corre en local; para publicarla haría falta un servidor externo.</w:t>
+        <w:t>En Render: https://cognia-gateway.onrender.com. GitHub Pages solo sirve archivos estáticos y la tienda necesita Java y una base de datos, por eso se usó Render con la base en Aiven.</w:t>
+      </w:r>
+    </w:p>
+    <w:p>
+      <w:r>
+        <w:rPr>
+          <w:b/>
+          <w:color w:val="7F4828"/>
+        </w:rPr>
+        <w:t>¿Cómo desplegaron?</w:t>
+      </w:r>
+    </w:p>
+    <w:p>
+      <w:r>
+        <w:t>Con un Blueprint (render.yaml) que crea los 4 servicios desde el repositorio de GitHub, un Dockerfile por servicio, variables de entorno en el panel y la base de datos en Aiven con SSL.</w:t>
       </w:r>
     </w:p>
     <w:p>
@@ -3591,7 +3966,7 @@
     </w:p>
     <w:p>
       <w:r>
-        <w:t>No. Se ejecuta con XAMPP (solo MariaDB), JARs de Spring Boot y binarios de Prometheus y Grafana para Windows.</w:t>
+        <w:t>En local no: XAMPP (solo MariaDB), JARs de Spring Boot y binarios de Prometheus y Grafana. Docker se usa solo para empaquetar en Render, que no ejecuta Java directamente.</w:t>
       </w:r>
     </w:p>
     <w:p>
@@ -3621,7 +3996,7 @@
         <w:pStyle w:val="ListBullet"/>
       </w:pPr>
       <w:r>
-        <w:t>Pipeline de CI/CD (por ejemplo, GitHub Actions) que compile y pruebe en cada commit; hoy el Build y el Test se ejecutan manualmente.</w:t>
+        <w:t>Pipeline de CI (por ejemplo, GitHub Actions) que compile y pruebe en cada commit; hoy el Build y el Test se ejecutan manualmente antes de subir a GitHub.</w:t>
       </w:r>
     </w:p>
     <w:p>
@@ -3653,7 +4028,15 @@
         <w:pStyle w:val="ListBullet"/>
       </w:pPr>
       <w:r>
-        <w:t>Publicar en un servicio en la nube si se requiere acceso público.</w:t>
+        <w:t>Pasar a un plan de pago para que los servicios no se duerman y usar almacenamiento persistente para las imágenes.</w:t>
+      </w:r>
+    </w:p>
+    <w:p>
+      <w:pPr>
+        <w:pStyle w:val="ListBullet"/>
+      </w:pPr>
+      <w:r>
+        <w:t>Llevar Prometheus y Grafana a la nube para monitorear también el entorno desplegado.</w:t>
       </w:r>
     </w:p>
     <w:sectPr>

</xml_diff>